<commit_message>
Strengthen TVF OS document library
</commit_message>
<xml_diff>
--- a/documents/kit-formulaires-conventions-tvf/00-index/tvf-index-bibliotheque-interne-complete.docx
+++ b/documents/kit-formulaires-conventions-tvf/00-index/tvf-index-bibliotheque-interne-complete.docx
@@ -902,15 +902,7 @@
         <w:pStyle w:val="ListBullet"/>
       </w:pPr>
       <w:r>
-        <w:t>00-index/tvf-index-bibliotheque-interne-complete.docx</w:t>
-      </w:r>
-    </w:p>
-    <w:p>
-      <w:pPr>
-        <w:pStyle w:val="ListBullet"/>
-      </w:pPr>
-      <w:r>
-        <w:t>00-index/tvf-index-kit-formulaires-conventions.docx</w:t>
+        <w:t>00-index/tvf-index-bibliotheque-formulaires-conventions.docx</w:t>
       </w:r>
     </w:p>
     <w:p>
@@ -926,7 +918,7 @@
         <w:pStyle w:val="ListBullet"/>
       </w:pPr>
       <w:r>
-        <w:t>02-collectivite-territoire/tvf-f-02-demande-collectivite---territoire-partenaire.docx</w:t>
+        <w:t>02-collectivite-territoire/tvf-f-02-demande-collectivite---territoire-de-cooperation.docx</w:t>
       </w:r>
     </w:p>
     <w:p>
@@ -950,7 +942,7 @@
         <w:pStyle w:val="ListBullet"/>
       </w:pPr>
       <w:r>
-        <w:t>05-entreprise-partenariat/tvf-f-05-demande-entreprise---partenariat-territorial.docx</w:t>
+        <w:t>05-entreprise-partenariat/tvf-f-05-demande-entreprise---cooperation-territoriale.docx</w:t>
       </w:r>
     </w:p>
     <w:p>
@@ -1038,7 +1030,7 @@
         <w:pStyle w:val="ListBullet"/>
       </w:pPr>
       <w:r>
-        <w:t>13-conventions-types/tvf-conv-04-convention-type-de-partenariat-entreprise.docx</w:t>
+        <w:t>13-conventions-types/tvf-conv-04-convention-type-de-cooperation-entreprise.docx</w:t>
       </w:r>
     </w:p>
     <w:p>
@@ -1158,7 +1150,7 @@
         <w:pStyle w:val="ListBullet"/>
       </w:pPr>
       <w:r>
-        <w:t>14-listes-pieces/tvf-lp-07-pieces-a-fournir---entreprise-ou-partenaire-economique.docx</w:t>
+        <w:t>14-listes-pieces/tvf-lp-07-pieces-a-fournir---entreprise-ou-acteur-economique.docx</w:t>
       </w:r>
     </w:p>
     <w:p>
@@ -1206,7 +1198,7 @@
         <w:pStyle w:val="ListBullet"/>
       </w:pPr>
       <w:r>
-        <w:t>15-courriers-prets-a-envoyer/tvf-cour-01-kit-courriers-demandes.docx</w:t>
+        <w:t>15-courriers-prets-a-envoyer/tvf-cour-01-courriers-types-demandes.docx</w:t>
       </w:r>
     </w:p>
     <w:p>

</xml_diff>